<commit_message>
Tema 2 formlari: Performans Gorevi 2.2 (proje) dereceli puanlama anahtari ve oz degerlendirme formu eklendi
</commit_message>
<xml_diff>
--- a/Formlar/TEMA-2-olcme-degerlendirme-Formlari.docx
+++ b/Formlar/TEMA-2-olcme-degerlendirme-Formlari.docx
@@ -10672,6 +10672,1617 @@
           <w:color w:val="000000" w:themeColor="text1"/>
         </w:rPr>
         <w:t xml:space="preserve">Sıcaklığın çözünürlüğe etkisini çözünmenin endotermik/ekzotermik olmasıyla ilişkilendirebilirim.</w:t>
+      </w:r>
+    </w:p>
+    <w:p>
+      <w:pPr>
+        <w:rPr>
+          <w:color w:val="000000" w:themeColor="text1"/>
+        </w:rPr>
+      </w:pPr>
+      <w:r>
+        <w:rPr>
+          <w:rFonts w:ascii="Segoe UI Symbol" w:hAnsi="Segoe UI Symbol" w:cs="Segoe UI Symbol"/>
+          <w:color w:val="000000" w:themeColor="text1"/>
+        </w:rPr>
+        <w:t>☐</w:t>
+      </w:r>
+      <w:r>
+        <w:rPr>
+          <w:color w:val="000000" w:themeColor="text1"/>
+        </w:rPr>
+        <w:t xml:space="preserve"> 5  </w:t>
+      </w:r>
+      <w:r>
+        <w:rPr>
+          <w:rFonts w:ascii="Segoe UI Symbol" w:hAnsi="Segoe UI Symbol" w:cs="Segoe UI Symbol"/>
+          <w:color w:val="000000" w:themeColor="text1"/>
+        </w:rPr>
+        <w:t>☐</w:t>
+      </w:r>
+      <w:r>
+        <w:rPr>
+          <w:color w:val="000000" w:themeColor="text1"/>
+        </w:rPr>
+        <w:t xml:space="preserve"> 4  </w:t>
+      </w:r>
+      <w:r>
+        <w:rPr>
+          <w:rFonts w:ascii="Segoe UI Symbol" w:hAnsi="Segoe UI Symbol" w:cs="Segoe UI Symbol"/>
+          <w:color w:val="000000" w:themeColor="text1"/>
+        </w:rPr>
+        <w:t>☐</w:t>
+      </w:r>
+      <w:r>
+        <w:rPr>
+          <w:color w:val="000000" w:themeColor="text1"/>
+        </w:rPr>
+        <w:t xml:space="preserve"> 3  </w:t>
+      </w:r>
+      <w:r>
+        <w:rPr>
+          <w:rFonts w:ascii="Segoe UI Symbol" w:hAnsi="Segoe UI Symbol" w:cs="Segoe UI Symbol"/>
+          <w:color w:val="000000" w:themeColor="text1"/>
+        </w:rPr>
+        <w:t>☐</w:t>
+      </w:r>
+      <w:r>
+        <w:rPr>
+          <w:color w:val="000000" w:themeColor="text1"/>
+        </w:rPr>
+        <w:t xml:space="preserve"> 2  </w:t>
+      </w:r>
+      <w:r>
+        <w:rPr>
+          <w:rFonts w:ascii="Segoe UI Symbol" w:hAnsi="Segoe UI Symbol" w:cs="Segoe UI Symbol"/>
+          <w:color w:val="000000" w:themeColor="text1"/>
+        </w:rPr>
+        <w:t>☐</w:t>
+      </w:r>
+      <w:r>
+        <w:rPr>
+          <w:color w:val="000000" w:themeColor="text1"/>
+        </w:rPr>
+        <w:t xml:space="preserve"> 1</w:t>
+      </w:r>
+    </w:p>
+    <w:p>
+      <w:pPr>
+        <w:pStyle w:val="Heading2"/>
+        <w:rPr>
+          <w:rFonts w:ascii="Times New Roman" w:hAnsi="Times New Roman" w:cs="Times New Roman"/>
+          <w:b/>
+          <w:bCs/>
+          <w:color w:val="000000" w:themeColor="text1"/>
+          <w:sz w:val="24"/>
+          <w:szCs w:val="24"/>
+        </w:rPr>
+      </w:pPr>
+      <w:r>
+        <w:rPr>
+          <w:rFonts w:ascii="Times New Roman" w:hAnsi="Times New Roman" w:cs="Times New Roman"/>
+          <w:b/>
+          <w:bCs/>
+          <w:color w:val="000000" w:themeColor="text1"/>
+          <w:sz w:val="24"/>
+          <w:szCs w:val="24"/>
+        </w:rPr>
+        <w:t xml:space="preserve">Kısa Yorumum</w:t>
+      </w:r>
+    </w:p>
+    <w:p>
+      <w:pPr>
+        <w:rPr>
+          <w:color w:val="000000" w:themeColor="text1"/>
+        </w:rPr>
+      </w:pPr>
+      <w:r>
+        <w:rPr>
+          <w:color w:val="000000" w:themeColor="text1"/>
+        </w:rPr>
+        <w:t xml:space="preserve">En iyi anladığım kısım: ....................................................................................................</w:t>
+      </w:r>
+    </w:p>
+    <w:p>
+      <w:pPr>
+        <w:rPr>
+          <w:color w:val="000000" w:themeColor="text1"/>
+        </w:rPr>
+      </w:pPr>
+      <w:r>
+        <w:rPr>
+          <w:color w:val="000000" w:themeColor="text1"/>
+        </w:rPr>
+        <w:t xml:space="preserve">En zorlandığım kısım: ....................................................................................................</w:t>
+      </w:r>
+    </w:p>
+    <w:p>
+      <w:pPr>
+        <w:rPr>
+          <w:color w:val="000000" w:themeColor="text1"/>
+        </w:rPr>
+      </w:pPr>
+      <w:r>
+        <w:rPr>
+          <w:color w:val="000000" w:themeColor="text1"/>
+        </w:rPr>
+        <w:t xml:space="preserve">Geliştirmek istediğim yönüm: ....................................................................................................</w:t>
+      </w:r>
+    </w:p>
+    <w:p>
+      <w:pPr>
+        <w:rPr>
+          <w:b/>
+          <w:bCs/>
+          <w:color w:val="000000" w:themeColor="text1"/>
+          <w:lang w:val="tr-TR"/>
+        </w:rPr>
+      </w:pPr>
+      <w:r>
+        <w:rPr>
+          <w:b/>
+          <w:bCs/>
+          <w:color w:val="000000" w:themeColor="text1"/>
+          <w:shd w:val="clear" w:color="auto" w:fill="FFC000"/>
+          <w:lang w:val="tr-TR"/>
+        </w:rPr>
+        <w:lastRenderedPageBreak/>
+        <w:t xml:space="preserve">Performans Görevi 2.2.-Dereceli Puanlama Anahtarı </w:t>
+      </w:r>
+    </w:p>
+    <w:p>
+      <w:pPr>
+        <w:rPr>
+          <w:b/>
+          <w:bCs/>
+          <w:color w:val="000000" w:themeColor="text1"/>
+          <w:lang w:val="tr-TR"/>
+        </w:rPr>
+      </w:pPr>
+      <w:r>
+        <w:rPr>
+          <w:b/>
+          <w:bCs/>
+          <w:color w:val="000000" w:themeColor="text1"/>
+          <w:lang w:val="tr-TR"/>
+        </w:rPr>
+        <w:t xml:space="preserve">Öğrencinin Adı Soyadı: </w:t>
+      </w:r>
+      <w:r>
+        <w:rPr>
+          <w:b/>
+          <w:bCs/>
+          <w:color w:val="000000" w:themeColor="text1"/>
+          <w:lang w:val="tr-TR"/>
+        </w:rPr>
+        <w:tab/>
+      </w:r>
+      <w:r>
+        <w:rPr>
+          <w:b/>
+          <w:bCs/>
+          <w:color w:val="000000" w:themeColor="text1"/>
+          <w:lang w:val="tr-TR"/>
+        </w:rPr>
+        <w:tab/>
+      </w:r>
+      <w:r>
+        <w:rPr>
+          <w:b/>
+          <w:bCs/>
+          <w:color w:val="000000" w:themeColor="text1"/>
+          <w:lang w:val="tr-TR"/>
+        </w:rPr>
+        <w:tab/>
+        <w:t>Numarası:</w:t>
+      </w:r>
+      <w:r>
+        <w:rPr>
+          <w:b/>
+          <w:bCs/>
+          <w:color w:val="000000" w:themeColor="text1"/>
+          <w:lang w:val="tr-TR"/>
+        </w:rPr>
+        <w:tab/>
+      </w:r>
+      <w:r>
+        <w:rPr>
+          <w:b/>
+          <w:bCs/>
+          <w:color w:val="000000" w:themeColor="text1"/>
+          <w:lang w:val="tr-TR"/>
+        </w:rPr>
+        <w:tab/>
+        <w:t>Sınıfı:</w:t>
+      </w:r>
+    </w:p>
+    <w:tbl>
+      <w:tblPr>
+        <w:tblStyle w:val="TableGrid"/>
+        <w:tblW w:w="0" w:type="auto"/>
+        <w:tblLook w:val="04A0" w:firstRow="1" w:lastRow="0" w:firstColumn="1" w:lastColumn="0" w:noHBand="0" w:noVBand="1"/>
+      </w:tblPr>
+      <w:tblGrid>
+        <w:gridCol w:w="1609"/>
+        <w:gridCol w:w="1593"/>
+        <w:gridCol w:w="1830"/>
+        <w:gridCol w:w="2027"/>
+        <w:gridCol w:w="1610"/>
+        <w:gridCol w:w="681"/>
+      </w:tblGrid>
+      <w:tr>
+        <w:tc>
+          <w:tcPr>
+            <w:tcW w:w="1440" w:type="dxa"/>
+          </w:tcPr>
+          <w:p>
+            <w:pPr>
+              <w:rPr>
+                <w:b/>
+                <w:bCs/>
+                <w:color w:val="000000" w:themeColor="text1"/>
+              </w:rPr>
+            </w:pPr>
+            <w:r>
+              <w:rPr>
+                <w:b/>
+                <w:bCs/>
+                <w:color w:val="000000" w:themeColor="text1"/>
+              </w:rPr>
+              <w:t>Ölçüt</w:t>
+            </w:r>
+            <w:r>
+              <w:rPr>
+                <w:b/>
+                <w:bCs/>
+                <w:color w:val="000000" w:themeColor="text1"/>
+              </w:rPr>
+              <w:t>ler</w:t>
+            </w:r>
+          </w:p>
+        </w:tc>
+        <w:tc>
+          <w:tcPr>
+            <w:tcW w:w="1440" w:type="dxa"/>
+          </w:tcPr>
+          <w:p>
+            <w:pPr>
+              <w:rPr>
+                <w:b/>
+                <w:bCs/>
+                <w:color w:val="000000" w:themeColor="text1"/>
+              </w:rPr>
+            </w:pPr>
+            <w:r>
+              <w:rPr>
+                <w:b/>
+                <w:bCs/>
+                <w:color w:val="000000" w:themeColor="text1"/>
+              </w:rPr>
+              <w:t>4 (Çok İyi)</w:t>
+            </w:r>
+          </w:p>
+        </w:tc>
+        <w:tc>
+          <w:tcPr>
+            <w:tcW w:w="1440" w:type="dxa"/>
+          </w:tcPr>
+          <w:p>
+            <w:pPr>
+              <w:rPr>
+                <w:b/>
+                <w:bCs/>
+                <w:color w:val="000000" w:themeColor="text1"/>
+              </w:rPr>
+            </w:pPr>
+            <w:r>
+              <w:rPr>
+                <w:b/>
+                <w:bCs/>
+                <w:color w:val="000000" w:themeColor="text1"/>
+              </w:rPr>
+              <w:t>3 (İyi)</w:t>
+            </w:r>
+          </w:p>
+        </w:tc>
+        <w:tc>
+          <w:tcPr>
+            <w:tcW w:w="1440" w:type="dxa"/>
+          </w:tcPr>
+          <w:p>
+            <w:pPr>
+              <w:rPr>
+                <w:b/>
+                <w:bCs/>
+                <w:color w:val="000000" w:themeColor="text1"/>
+              </w:rPr>
+            </w:pPr>
+            <w:r>
+              <w:rPr>
+                <w:b/>
+                <w:bCs/>
+                <w:color w:val="000000" w:themeColor="text1"/>
+              </w:rPr>
+              <w:t>2 (Geliştirilmeli)</w:t>
+            </w:r>
+          </w:p>
+        </w:tc>
+        <w:tc>
+          <w:tcPr>
+            <w:tcW w:w="1440" w:type="dxa"/>
+          </w:tcPr>
+          <w:p>
+            <w:pPr>
+              <w:rPr>
+                <w:b/>
+                <w:bCs/>
+                <w:color w:val="000000" w:themeColor="text1"/>
+              </w:rPr>
+            </w:pPr>
+            <w:r>
+              <w:rPr>
+                <w:b/>
+                <w:bCs/>
+                <w:color w:val="000000" w:themeColor="text1"/>
+              </w:rPr>
+              <w:t>1 (Yetersiz)</w:t>
+            </w:r>
+          </w:p>
+        </w:tc>
+        <w:tc>
+          <w:tcPr>
+            <w:tcW w:w="1440" w:type="dxa"/>
+          </w:tcPr>
+          <w:p>
+            <w:pPr>
+              <w:rPr>
+                <w:b/>
+                <w:bCs/>
+                <w:color w:val="000000" w:themeColor="text1"/>
+              </w:rPr>
+            </w:pPr>
+            <w:r>
+              <w:rPr>
+                <w:b/>
+                <w:bCs/>
+                <w:color w:val="000000" w:themeColor="text1"/>
+              </w:rPr>
+              <w:t>Puan</w:t>
+            </w:r>
+          </w:p>
+        </w:tc>
+      </w:tr>
+      <w:tr>
+        <w:tc>
+          <w:tcPr>
+            <w:tcW w:w="1440" w:type="dxa"/>
+          </w:tcPr>
+          <w:p>
+            <w:pPr>
+              <w:rPr>
+                <w:color w:val="000000" w:themeColor="text1"/>
+              </w:rPr>
+            </w:pPr>
+            <w:r>
+              <w:rPr>
+                <w:color w:val="000000" w:themeColor="text1"/>
+              </w:rPr>
+              <w:t xml:space="preserve">Proje konusunu ve araştırma sorusunu belirleme</w:t>
+            </w:r>
+          </w:p>
+        </w:tc>
+        <w:tc>
+          <w:tcPr>
+            <w:tcW w:w="1440" w:type="dxa"/>
+          </w:tcPr>
+          <w:p>
+            <w:pPr>
+              <w:rPr>
+                <w:color w:val="000000" w:themeColor="text1"/>
+              </w:rPr>
+            </w:pPr>
+            <w:r>
+              <w:rPr>
+                <w:color w:val="000000" w:themeColor="text1"/>
+              </w:rPr>
+              <w:t xml:space="preserve">Seçilen çevre sorunu açıkça tanımlanmış, çözünürlük dengesiyle ilişkili net bir araştırma sorusu yazılmıştır.</w:t>
+            </w:r>
+          </w:p>
+        </w:tc>
+        <w:tc>
+          <w:tcPr>
+            <w:tcW w:w="1440" w:type="dxa"/>
+          </w:tcPr>
+          <w:p>
+            <w:pPr>
+              <w:rPr>
+                <w:color w:val="000000" w:themeColor="text1"/>
+              </w:rPr>
+            </w:pPr>
+            <w:r>
+              <w:rPr>
+                <w:color w:val="000000" w:themeColor="text1"/>
+              </w:rPr>
+              <w:t xml:space="preserve">Konu ve araştırma sorusu belirlenmiş, küçük belirsizlikler vardır.</w:t>
+            </w:r>
+          </w:p>
+        </w:tc>
+        <w:tc>
+          <w:tcPr>
+            <w:tcW w:w="1440" w:type="dxa"/>
+          </w:tcPr>
+          <w:p>
+            <w:pPr>
+              <w:rPr>
+                <w:color w:val="000000" w:themeColor="text1"/>
+              </w:rPr>
+            </w:pPr>
+            <w:r>
+              <w:rPr>
+                <w:color w:val="000000" w:themeColor="text1"/>
+              </w:rPr>
+              <w:t xml:space="preserve">Araştırma sorusu belirsiz ya da konuyla zayıf ilişkilidir.</w:t>
+            </w:r>
+          </w:p>
+        </w:tc>
+        <w:tc>
+          <w:tcPr>
+            <w:tcW w:w="1440" w:type="dxa"/>
+          </w:tcPr>
+          <w:p>
+            <w:pPr>
+              <w:rPr>
+                <w:color w:val="000000" w:themeColor="text1"/>
+              </w:rPr>
+            </w:pPr>
+            <w:r>
+              <w:rPr>
+                <w:color w:val="000000" w:themeColor="text1"/>
+              </w:rPr>
+              <w:t xml:space="preserve">Konu ve araştırma sorusu belirlenmemiştir.</w:t>
+            </w:r>
+          </w:p>
+        </w:tc>
+        <w:tc>
+          <w:tcPr>
+            <w:tcW w:w="1440" w:type="dxa"/>
+          </w:tcPr>
+          <w:p>
+            <w:pPr>
+              <w:rPr>
+                <w:color w:val="000000" w:themeColor="text1"/>
+              </w:rPr>
+            </w:pPr>
+          </w:p>
+        </w:tc>
+      </w:tr>
+      <w:tr>
+        <w:tc>
+          <w:tcPr>
+            <w:tcW w:w="1440" w:type="dxa"/>
+          </w:tcPr>
+          <w:p>
+            <w:pPr>
+              <w:rPr>
+                <w:color w:val="000000" w:themeColor="text1"/>
+              </w:rPr>
+            </w:pPr>
+            <w:r>
+              <w:rPr>
+                <w:color w:val="000000" w:themeColor="text1"/>
+              </w:rPr>
+              <w:t xml:space="preserve">Veri ve kaynak toplama</w:t>
+            </w:r>
+          </w:p>
+        </w:tc>
+        <w:tc>
+          <w:tcPr>
+            <w:tcW w:w="1440" w:type="dxa"/>
+          </w:tcPr>
+          <w:p>
+            <w:pPr>
+              <w:rPr>
+                <w:color w:val="000000" w:themeColor="text1"/>
+              </w:rPr>
+            </w:pPr>
+            <w:r>
+              <w:rPr>
+                <w:color w:val="000000" w:themeColor="text1"/>
+              </w:rPr>
+              <w:t xml:space="preserve">Güvenilir ve çeşitli kaynaklardan güncel veriler toplanmış, kaynaklar doğru gösterilmiştir.</w:t>
+            </w:r>
+          </w:p>
+        </w:tc>
+        <w:tc>
+          <w:tcPr>
+            <w:tcW w:w="1440" w:type="dxa"/>
+          </w:tcPr>
+          <w:p>
+            <w:pPr>
+              <w:rPr>
+                <w:color w:val="000000" w:themeColor="text1"/>
+              </w:rPr>
+            </w:pPr>
+            <w:r>
+              <w:rPr>
+                <w:color w:val="000000" w:themeColor="text1"/>
+              </w:rPr>
+              <w:t xml:space="preserve">Veriler yeterlidir, kaynak gösteriminde küçük eksikler vardır.</w:t>
+            </w:r>
+          </w:p>
+        </w:tc>
+        <w:tc>
+          <w:tcPr>
+            <w:tcW w:w="1440" w:type="dxa"/>
+          </w:tcPr>
+          <w:p>
+            <w:pPr>
+              <w:rPr>
+                <w:color w:val="000000" w:themeColor="text1"/>
+              </w:rPr>
+            </w:pPr>
+            <w:r>
+              <w:rPr>
+                <w:color w:val="000000" w:themeColor="text1"/>
+              </w:rPr>
+              <w:t xml:space="preserve">Veriler sınırlı ya da kaynakları belirsizdir.</w:t>
+            </w:r>
+          </w:p>
+        </w:tc>
+        <w:tc>
+          <w:tcPr>
+            <w:tcW w:w="1440" w:type="dxa"/>
+          </w:tcPr>
+          <w:p>
+            <w:pPr>
+              <w:rPr>
+                <w:color w:val="000000" w:themeColor="text1"/>
+              </w:rPr>
+            </w:pPr>
+            <w:r>
+              <w:rPr>
+                <w:color w:val="000000" w:themeColor="text1"/>
+              </w:rPr>
+              <w:t xml:space="preserve">Veri toplanmamıştır.</w:t>
+            </w:r>
+          </w:p>
+        </w:tc>
+        <w:tc>
+          <w:tcPr>
+            <w:tcW w:w="1440" w:type="dxa"/>
+          </w:tcPr>
+          <w:p>
+            <w:pPr>
+              <w:rPr>
+                <w:color w:val="000000" w:themeColor="text1"/>
+              </w:rPr>
+            </w:pPr>
+          </w:p>
+        </w:tc>
+      </w:tr>
+      <w:tr>
+        <w:tc>
+          <w:tcPr>
+            <w:tcW w:w="1440" w:type="dxa"/>
+          </w:tcPr>
+          <w:p>
+            <w:pPr>
+              <w:rPr>
+                <w:color w:val="000000" w:themeColor="text1"/>
+              </w:rPr>
+            </w:pPr>
+            <w:r>
+              <w:rPr>
+                <w:color w:val="000000" w:themeColor="text1"/>
+              </w:rPr>
+              <w:t xml:space="preserve">Çözünürlük dengesiyle ilişkilendirme</w:t>
+            </w:r>
+          </w:p>
+        </w:tc>
+        <w:tc>
+          <w:tcPr>
+            <w:tcW w:w="1440" w:type="dxa"/>
+          </w:tcPr>
+          <w:p>
+            <w:pPr>
+              <w:rPr>
+                <w:color w:val="000000" w:themeColor="text1"/>
+              </w:rPr>
+            </w:pPr>
+            <w:r>
+              <w:rPr>
+                <w:color w:val="000000" w:themeColor="text1"/>
+              </w:rPr>
+              <w:t xml:space="preserve">Sıcaklık, ortak iyon ve pH gibi faktörlerin etkisi Le Chatelier ilkesiyle doğru biçimde açıklanmıştır.</w:t>
+            </w:r>
+          </w:p>
+        </w:tc>
+        <w:tc>
+          <w:tcPr>
+            <w:tcW w:w="1440" w:type="dxa"/>
+          </w:tcPr>
+          <w:p>
+            <w:pPr>
+              <w:rPr>
+                <w:color w:val="000000" w:themeColor="text1"/>
+              </w:rPr>
+            </w:pPr>
+            <w:r>
+              <w:rPr>
+                <w:color w:val="000000" w:themeColor="text1"/>
+              </w:rPr>
+              <w:t xml:space="preserve">İlişkilendirme genel olarak doğrudur, bazı ayrıntılar eksiktir.</w:t>
+            </w:r>
+          </w:p>
+        </w:tc>
+        <w:tc>
+          <w:tcPr>
+            <w:tcW w:w="1440" w:type="dxa"/>
+          </w:tcPr>
+          <w:p>
+            <w:pPr>
+              <w:rPr>
+                <w:color w:val="000000" w:themeColor="text1"/>
+              </w:rPr>
+            </w:pPr>
+            <w:r>
+              <w:rPr>
+                <w:color w:val="000000" w:themeColor="text1"/>
+              </w:rPr>
+              <w:t xml:space="preserve">İlişkilendirme yüzeysel ya da kısmen hatalıdır.</w:t>
+            </w:r>
+          </w:p>
+        </w:tc>
+        <w:tc>
+          <w:tcPr>
+            <w:tcW w:w="1440" w:type="dxa"/>
+          </w:tcPr>
+          <w:p>
+            <w:pPr>
+              <w:rPr>
+                <w:color w:val="000000" w:themeColor="text1"/>
+              </w:rPr>
+            </w:pPr>
+            <w:r>
+              <w:rPr>
+                <w:color w:val="000000" w:themeColor="text1"/>
+              </w:rPr>
+              <w:t xml:space="preserve">Çözünürlük dengesiyle ilişki kurulmamıştır.</w:t>
+            </w:r>
+          </w:p>
+        </w:tc>
+        <w:tc>
+          <w:tcPr>
+            <w:tcW w:w="1440" w:type="dxa"/>
+          </w:tcPr>
+          <w:p>
+            <w:pPr>
+              <w:rPr>
+                <w:color w:val="000000" w:themeColor="text1"/>
+              </w:rPr>
+            </w:pPr>
+          </w:p>
+        </w:tc>
+      </w:tr>
+      <w:tr>
+        <w:tc>
+          <w:tcPr>
+            <w:tcW w:w="1440" w:type="dxa"/>
+          </w:tcPr>
+          <w:p>
+            <w:pPr>
+              <w:rPr>
+                <w:color w:val="000000" w:themeColor="text1"/>
+              </w:rPr>
+            </w:pPr>
+            <w:r>
+              <w:rPr>
+                <w:color w:val="000000" w:themeColor="text1"/>
+              </w:rPr>
+              <w:t xml:space="preserve">Çözüm önerisi geliştirme</w:t>
+            </w:r>
+          </w:p>
+        </w:tc>
+        <w:tc>
+          <w:tcPr>
+            <w:tcW w:w="1440" w:type="dxa"/>
+          </w:tcPr>
+          <w:p>
+            <w:pPr>
+              <w:rPr>
+                <w:color w:val="000000" w:themeColor="text1"/>
+              </w:rPr>
+            </w:pPr>
+            <w:r>
+              <w:rPr>
+                <w:color w:val="000000" w:themeColor="text1"/>
+              </w:rPr>
+              <w:t xml:space="preserve">Uygulanabilir, özgün ve verilere dayalı çözüm önerileri geliştirilmiştir.</w:t>
+            </w:r>
+          </w:p>
+        </w:tc>
+        <w:tc>
+          <w:tcPr>
+            <w:tcW w:w="1440" w:type="dxa"/>
+          </w:tcPr>
+          <w:p>
+            <w:pPr>
+              <w:rPr>
+                <w:color w:val="000000" w:themeColor="text1"/>
+              </w:rPr>
+            </w:pPr>
+            <w:r>
+              <w:rPr>
+                <w:color w:val="000000" w:themeColor="text1"/>
+              </w:rPr>
+              <w:t xml:space="preserve">Çözüm önerileri uygundur ancak verilerle yeterince desteklenmemiştir.</w:t>
+            </w:r>
+          </w:p>
+        </w:tc>
+        <w:tc>
+          <w:tcPr>
+            <w:tcW w:w="1440" w:type="dxa"/>
+          </w:tcPr>
+          <w:p>
+            <w:pPr>
+              <w:rPr>
+                <w:color w:val="000000" w:themeColor="text1"/>
+              </w:rPr>
+            </w:pPr>
+            <w:r>
+              <w:rPr>
+                <w:color w:val="000000" w:themeColor="text1"/>
+              </w:rPr>
+              <w:t xml:space="preserve">Öneriler genel ve uygulanabilirliği düşüktür.</w:t>
+            </w:r>
+          </w:p>
+        </w:tc>
+        <w:tc>
+          <w:tcPr>
+            <w:tcW w:w="1440" w:type="dxa"/>
+          </w:tcPr>
+          <w:p>
+            <w:pPr>
+              <w:rPr>
+                <w:color w:val="000000" w:themeColor="text1"/>
+              </w:rPr>
+            </w:pPr>
+            <w:r>
+              <w:rPr>
+                <w:color w:val="000000" w:themeColor="text1"/>
+              </w:rPr>
+              <w:t xml:space="preserve">Çözüm önerisi geliştirilmemiştir.</w:t>
+            </w:r>
+          </w:p>
+        </w:tc>
+        <w:tc>
+          <w:tcPr>
+            <w:tcW w:w="1440" w:type="dxa"/>
+          </w:tcPr>
+          <w:p>
+            <w:pPr>
+              <w:rPr>
+                <w:color w:val="000000" w:themeColor="text1"/>
+              </w:rPr>
+            </w:pPr>
+          </w:p>
+        </w:tc>
+      </w:tr>
+      <w:tr>
+        <w:tc>
+          <w:tcPr>
+            <w:tcW w:w="1440" w:type="dxa"/>
+          </w:tcPr>
+          <w:p>
+            <w:pPr>
+              <w:rPr>
+                <w:color w:val="000000" w:themeColor="text1"/>
+              </w:rPr>
+            </w:pPr>
+            <w:r>
+              <w:rPr>
+                <w:color w:val="000000" w:themeColor="text1"/>
+              </w:rPr>
+              <w:t xml:space="preserve">Sunum ve paylaşım</w:t>
+            </w:r>
+          </w:p>
+        </w:tc>
+        <w:tc>
+          <w:tcPr>
+            <w:tcW w:w="1440" w:type="dxa"/>
+          </w:tcPr>
+          <w:p>
+            <w:pPr>
+              <w:rPr>
+                <w:color w:val="000000" w:themeColor="text1"/>
+              </w:rPr>
+            </w:pPr>
+            <w:r>
+              <w:rPr>
+                <w:color w:val="000000" w:themeColor="text1"/>
+              </w:rPr>
+              <w:t xml:space="preserve">Ürün (poster, sunum, rapor) düzenli, anlaşılır ve bilimsel dile uygundur; sorular doğru yanıtlanmıştır.</w:t>
+            </w:r>
+          </w:p>
+        </w:tc>
+        <w:tc>
+          <w:tcPr>
+            <w:tcW w:w="1440" w:type="dxa"/>
+          </w:tcPr>
+          <w:p>
+            <w:pPr>
+              <w:rPr>
+                <w:color w:val="000000" w:themeColor="text1"/>
+              </w:rPr>
+            </w:pPr>
+            <w:r>
+              <w:rPr>
+                <w:color w:val="000000" w:themeColor="text1"/>
+              </w:rPr>
+              <w:t xml:space="preserve">Ürün anlaşılırdır, küçük eksikler vardır.</w:t>
+            </w:r>
+          </w:p>
+        </w:tc>
+        <w:tc>
+          <w:tcPr>
+            <w:tcW w:w="1440" w:type="dxa"/>
+          </w:tcPr>
+          <w:p>
+            <w:pPr>
+              <w:rPr>
+                <w:color w:val="000000" w:themeColor="text1"/>
+              </w:rPr>
+            </w:pPr>
+            <w:r>
+              <w:rPr>
+                <w:color w:val="000000" w:themeColor="text1"/>
+              </w:rPr>
+              <w:t xml:space="preserve">Ürün düzensiz ya da eksiktir.</w:t>
+            </w:r>
+          </w:p>
+        </w:tc>
+        <w:tc>
+          <w:tcPr>
+            <w:tcW w:w="1440" w:type="dxa"/>
+          </w:tcPr>
+          <w:p>
+            <w:pPr>
+              <w:rPr>
+                <w:color w:val="000000" w:themeColor="text1"/>
+              </w:rPr>
+            </w:pPr>
+            <w:r>
+              <w:rPr>
+                <w:color w:val="000000" w:themeColor="text1"/>
+              </w:rPr>
+              <w:t xml:space="preserve">Ürün hazırlanmamıştır.</w:t>
+            </w:r>
+          </w:p>
+        </w:tc>
+        <w:tc>
+          <w:tcPr>
+            <w:tcW w:w="1440" w:type="dxa"/>
+          </w:tcPr>
+          <w:p>
+            <w:pPr>
+              <w:rPr>
+                <w:color w:val="000000" w:themeColor="text1"/>
+              </w:rPr>
+            </w:pPr>
+          </w:p>
+        </w:tc>
+      </w:tr>
+    </w:tbl>
+    <w:p>
+      <w:pPr>
+        <w:rPr>
+          <w:b/>
+          <w:bCs/>
+          <w:color w:val="000000" w:themeColor="text1"/>
+          <w:lang w:val="tr-TR"/>
+        </w:rPr>
+      </w:pPr>
+      <w:r>
+        <w:rPr>
+          <w:b/>
+          <w:bCs/>
+          <w:color w:val="000000" w:themeColor="text1"/>
+          <w:lang w:val="tr-TR"/>
+        </w:rPr>
+        <w:t xml:space="preserve">Toplam Puan: 20 üzerinden değerlendirilir.  </w:t>
+      </w:r>
+    </w:p>
+    <w:p>
+      <w:pPr>
+        <w:rPr>
+          <w:color w:val="000000" w:themeColor="text1"/>
+          <w:lang w:val="tr-TR"/>
+        </w:rPr>
+      </w:pPr>
+      <w:r>
+        <w:rPr>
+          <w:color w:val="000000" w:themeColor="text1"/>
+          <w:lang w:val="tr-TR"/>
+        </w:rPr>
+        <w:t xml:space="preserve">- 16-20: Çok iyi  </w:t>
+      </w:r>
+    </w:p>
+    <w:p>
+      <w:pPr>
+        <w:rPr>
+          <w:color w:val="000000" w:themeColor="text1"/>
+          <w:lang w:val="tr-TR"/>
+        </w:rPr>
+      </w:pPr>
+      <w:r>
+        <w:rPr>
+          <w:color w:val="000000" w:themeColor="text1"/>
+          <w:lang w:val="tr-TR"/>
+        </w:rPr>
+        <w:t xml:space="preserve">- 11-15: İyi  </w:t>
+      </w:r>
+    </w:p>
+    <w:p>
+      <w:pPr>
+        <w:rPr>
+          <w:color w:val="000000" w:themeColor="text1"/>
+          <w:lang w:val="tr-TR"/>
+        </w:rPr>
+      </w:pPr>
+      <w:r>
+        <w:rPr>
+          <w:color w:val="000000" w:themeColor="text1"/>
+          <w:lang w:val="tr-TR"/>
+        </w:rPr>
+        <w:t xml:space="preserve">- 6-10: Geliştirilmeli  </w:t>
+      </w:r>
+    </w:p>
+    <w:p>
+      <w:pPr>
+        <w:rPr>
+          <w:color w:val="000000" w:themeColor="text1"/>
+          <w:lang w:val="tr-TR"/>
+        </w:rPr>
+      </w:pPr>
+      <w:r>
+        <w:rPr>
+          <w:color w:val="000000" w:themeColor="text1"/>
+          <w:lang w:val="tr-TR"/>
+        </w:rPr>
+        <w:t xml:space="preserve">- 5 ve altı: Yetersiz  </w:t>
+      </w:r>
+    </w:p>
+    <w:p>
+      <w:pPr>
+        <w:rPr>
+          <w:color w:val="000000" w:themeColor="text1"/>
+          <w:lang w:val="tr-TR"/>
+        </w:rPr>
+      </w:pPr>
+      <w:r>
+        <w:br w:type="page"/>
+      </w:r>
+    </w:p>
+    <w:p>
+      <w:pPr>
+        <w:shd w:val="clear" w:color="auto" w:fill="FFC000"/>
+        <w:rPr>
+          <w:b/>
+          <w:bCs/>
+          <w:color w:val="000000" w:themeColor="text1"/>
+          <w:lang w:val="tr-TR"/>
+        </w:rPr>
+      </w:pPr>
+      <w:r>
+        <w:rPr>
+          <w:b/>
+          <w:bCs/>
+          <w:color w:val="000000" w:themeColor="text1"/>
+          <w:lang w:val="tr-TR"/>
+        </w:rPr>
+        <w:lastRenderedPageBreak/>
+        <w:t xml:space="preserve">Performans Görevi 2.2.-Öz Değerlendirme Formu </w:t>
+      </w:r>
+    </w:p>
+    <w:p>
+      <w:pPr>
+        <w:rPr>
+          <w:b/>
+          <w:bCs/>
+          <w:color w:val="000000" w:themeColor="text1"/>
+          <w:lang w:val="tr-TR"/>
+        </w:rPr>
+      </w:pPr>
+      <w:r>
+        <w:rPr>
+          <w:b/>
+          <w:bCs/>
+          <w:color w:val="000000" w:themeColor="text1"/>
+          <w:lang w:val="tr-TR"/>
+        </w:rPr>
+        <w:t xml:space="preserve">Öğrencinin Adı Soyadı: </w:t>
+      </w:r>
+      <w:r>
+        <w:rPr>
+          <w:b/>
+          <w:bCs/>
+          <w:color w:val="000000" w:themeColor="text1"/>
+          <w:lang w:val="tr-TR"/>
+        </w:rPr>
+        <w:tab/>
+      </w:r>
+      <w:r>
+        <w:rPr>
+          <w:b/>
+          <w:bCs/>
+          <w:color w:val="000000" w:themeColor="text1"/>
+          <w:lang w:val="tr-TR"/>
+        </w:rPr>
+        <w:tab/>
+      </w:r>
+      <w:r>
+        <w:rPr>
+          <w:b/>
+          <w:bCs/>
+          <w:color w:val="000000" w:themeColor="text1"/>
+          <w:lang w:val="tr-TR"/>
+        </w:rPr>
+        <w:tab/>
+        <w:t>Numarası:</w:t>
+      </w:r>
+      <w:r>
+        <w:rPr>
+          <w:b/>
+          <w:bCs/>
+          <w:color w:val="000000" w:themeColor="text1"/>
+          <w:lang w:val="tr-TR"/>
+        </w:rPr>
+        <w:tab/>
+      </w:r>
+      <w:r>
+        <w:rPr>
+          <w:b/>
+          <w:bCs/>
+          <w:color w:val="000000" w:themeColor="text1"/>
+          <w:lang w:val="tr-TR"/>
+        </w:rPr>
+        <w:tab/>
+        <w:t>Sınıfı:</w:t>
+      </w:r>
+    </w:p>
+    <w:p>
+      <w:pPr>
+        <w:rPr>
+          <w:b/>
+          <w:bCs/>
+          <w:color w:val="000000" w:themeColor="text1"/>
+        </w:rPr>
+      </w:pPr>
+      <w:r>
+        <w:rPr>
+          <w:b/>
+          <w:bCs/>
+          <w:color w:val="000000" w:themeColor="text1"/>
+        </w:rPr>
+        <w:t>Aşağıdaki ifadeleri okuyunuz ve kendinizi 5-1 arasında değerlendiriniz.</w:t>
+      </w:r>
+    </w:p>
+    <w:p>
+      <w:pPr>
+        <w:rPr>
+          <w:color w:val="000000" w:themeColor="text1"/>
+        </w:rPr>
+      </w:pPr>
+      <w:r>
+        <w:rPr>
+          <w:color w:val="000000" w:themeColor="text1"/>
+        </w:rPr>
+        <w:br/>
+        <w:t>(5) Çok iyi  (4) İyi  (3) Orta  (2) Geliştirilmeli  (1) Başlangıç</w:t>
+      </w:r>
+    </w:p>
+    <w:p>
+      <w:pPr>
+        <w:pStyle w:val="Heading2"/>
+        <w:rPr>
+          <w:rFonts w:ascii="Times New Roman" w:hAnsi="Times New Roman" w:cs="Times New Roman"/>
+          <w:color w:val="000000" w:themeColor="text1"/>
+          <w:sz w:val="24"/>
+          <w:szCs w:val="24"/>
+        </w:rPr>
+      </w:pPr>
+      <w:r>
+        <w:rPr>
+          <w:rFonts w:ascii="Times New Roman" w:hAnsi="Times New Roman" w:cs="Times New Roman"/>
+          <w:b/>
+          <w:bCs/>
+          <w:color w:val="000000" w:themeColor="text1"/>
+          <w:sz w:val="24"/>
+          <w:szCs w:val="24"/>
+        </w:rPr>
+        <w:t xml:space="preserve">1. Planlama</w:t>
+      </w:r>
+    </w:p>
+    <w:p>
+      <w:pPr>
+        <w:rPr>
+          <w:color w:val="000000" w:themeColor="text1"/>
+        </w:rPr>
+      </w:pPr>
+      <w:r>
+        <w:rPr>
+          <w:color w:val="000000" w:themeColor="text1"/>
+        </w:rPr>
+        <w:t xml:space="preserve">Proje konumu ve araştırma sorumu açık biçimde belirledim.</w:t>
+      </w:r>
+    </w:p>
+    <w:p>
+      <w:pPr>
+        <w:rPr>
+          <w:color w:val="000000" w:themeColor="text1"/>
+        </w:rPr>
+      </w:pPr>
+      <w:r>
+        <w:rPr>
+          <w:rFonts w:ascii="Segoe UI Symbol" w:hAnsi="Segoe UI Symbol" w:cs="Segoe UI Symbol"/>
+          <w:color w:val="000000" w:themeColor="text1"/>
+        </w:rPr>
+        <w:t>☐</w:t>
+      </w:r>
+      <w:r>
+        <w:rPr>
+          <w:color w:val="000000" w:themeColor="text1"/>
+        </w:rPr>
+        <w:t xml:space="preserve"> 5  </w:t>
+      </w:r>
+      <w:r>
+        <w:rPr>
+          <w:rFonts w:ascii="Segoe UI Symbol" w:hAnsi="Segoe UI Symbol" w:cs="Segoe UI Symbol"/>
+          <w:color w:val="000000" w:themeColor="text1"/>
+        </w:rPr>
+        <w:t>☐</w:t>
+      </w:r>
+      <w:r>
+        <w:rPr>
+          <w:color w:val="000000" w:themeColor="text1"/>
+        </w:rPr>
+        <w:t xml:space="preserve"> 4  </w:t>
+      </w:r>
+      <w:r>
+        <w:rPr>
+          <w:rFonts w:ascii="Segoe UI Symbol" w:hAnsi="Segoe UI Symbol" w:cs="Segoe UI Symbol"/>
+          <w:color w:val="000000" w:themeColor="text1"/>
+        </w:rPr>
+        <w:t>☐</w:t>
+      </w:r>
+      <w:r>
+        <w:rPr>
+          <w:color w:val="000000" w:themeColor="text1"/>
+        </w:rPr>
+        <w:t xml:space="preserve"> 3  </w:t>
+      </w:r>
+      <w:r>
+        <w:rPr>
+          <w:rFonts w:ascii="Segoe UI Symbol" w:hAnsi="Segoe UI Symbol" w:cs="Segoe UI Symbol"/>
+          <w:color w:val="000000" w:themeColor="text1"/>
+        </w:rPr>
+        <w:t>☐</w:t>
+      </w:r>
+      <w:r>
+        <w:rPr>
+          <w:color w:val="000000" w:themeColor="text1"/>
+        </w:rPr>
+        <w:t xml:space="preserve"> 2  </w:t>
+      </w:r>
+      <w:r>
+        <w:rPr>
+          <w:rFonts w:ascii="Segoe UI Symbol" w:hAnsi="Segoe UI Symbol" w:cs="Segoe UI Symbol"/>
+          <w:color w:val="000000" w:themeColor="text1"/>
+        </w:rPr>
+        <w:t>☐</w:t>
+      </w:r>
+      <w:r>
+        <w:rPr>
+          <w:color w:val="000000" w:themeColor="text1"/>
+        </w:rPr>
+        <w:t xml:space="preserve"> 1</w:t>
+      </w:r>
+    </w:p>
+    <w:p>
+      <w:pPr>
+        <w:rPr>
+          <w:color w:val="000000" w:themeColor="text1"/>
+        </w:rPr>
+      </w:pPr>
+      <w:r>
+        <w:rPr>
+          <w:color w:val="000000" w:themeColor="text1"/>
+        </w:rPr>
+        <w:t xml:space="preserve">Grubumla görev paylaşımı yaparak zamanı etkili kullandım.</w:t>
+      </w:r>
+    </w:p>
+    <w:p>
+      <w:pPr>
+        <w:rPr>
+          <w:color w:val="000000" w:themeColor="text1"/>
+        </w:rPr>
+      </w:pPr>
+      <w:r>
+        <w:rPr>
+          <w:rFonts w:ascii="Segoe UI Symbol" w:hAnsi="Segoe UI Symbol" w:cs="Segoe UI Symbol"/>
+          <w:color w:val="000000" w:themeColor="text1"/>
+        </w:rPr>
+        <w:t>☐</w:t>
+      </w:r>
+      <w:r>
+        <w:rPr>
+          <w:color w:val="000000" w:themeColor="text1"/>
+        </w:rPr>
+        <w:t xml:space="preserve"> 5  </w:t>
+      </w:r>
+      <w:r>
+        <w:rPr>
+          <w:rFonts w:ascii="Segoe UI Symbol" w:hAnsi="Segoe UI Symbol" w:cs="Segoe UI Symbol"/>
+          <w:color w:val="000000" w:themeColor="text1"/>
+        </w:rPr>
+        <w:t>☐</w:t>
+      </w:r>
+      <w:r>
+        <w:rPr>
+          <w:color w:val="000000" w:themeColor="text1"/>
+        </w:rPr>
+        <w:t xml:space="preserve"> 4  </w:t>
+      </w:r>
+      <w:r>
+        <w:rPr>
+          <w:rFonts w:ascii="Segoe UI Symbol" w:hAnsi="Segoe UI Symbol" w:cs="Segoe UI Symbol"/>
+          <w:color w:val="000000" w:themeColor="text1"/>
+        </w:rPr>
+        <w:t>☐</w:t>
+      </w:r>
+      <w:r>
+        <w:rPr>
+          <w:color w:val="000000" w:themeColor="text1"/>
+        </w:rPr>
+        <w:t xml:space="preserve"> 3  </w:t>
+      </w:r>
+      <w:r>
+        <w:rPr>
+          <w:rFonts w:ascii="Segoe UI Symbol" w:hAnsi="Segoe UI Symbol" w:cs="Segoe UI Symbol"/>
+          <w:color w:val="000000" w:themeColor="text1"/>
+        </w:rPr>
+        <w:t>☐</w:t>
+      </w:r>
+      <w:r>
+        <w:rPr>
+          <w:color w:val="000000" w:themeColor="text1"/>
+        </w:rPr>
+        <w:t xml:space="preserve"> 2  </w:t>
+      </w:r>
+      <w:r>
+        <w:rPr>
+          <w:rFonts w:ascii="Segoe UI Symbol" w:hAnsi="Segoe UI Symbol" w:cs="Segoe UI Symbol"/>
+          <w:color w:val="000000" w:themeColor="text1"/>
+        </w:rPr>
+        <w:t>☐</w:t>
+      </w:r>
+      <w:r>
+        <w:rPr>
+          <w:color w:val="000000" w:themeColor="text1"/>
+        </w:rPr>
+        <w:t xml:space="preserve"> 1</w:t>
+      </w:r>
+    </w:p>
+    <w:p>
+      <w:pPr>
+        <w:pStyle w:val="Heading2"/>
+        <w:rPr>
+          <w:rFonts w:ascii="Times New Roman" w:hAnsi="Times New Roman" w:cs="Times New Roman"/>
+          <w:color w:val="000000" w:themeColor="text1"/>
+          <w:sz w:val="24"/>
+          <w:szCs w:val="24"/>
+        </w:rPr>
+      </w:pPr>
+      <w:r>
+        <w:rPr>
+          <w:rFonts w:ascii="Times New Roman" w:hAnsi="Times New Roman" w:cs="Times New Roman"/>
+          <w:b/>
+          <w:bCs/>
+          <w:color w:val="000000" w:themeColor="text1"/>
+          <w:sz w:val="24"/>
+          <w:szCs w:val="24"/>
+        </w:rPr>
+        <w:t xml:space="preserve">2. Veri ve Kaynak</w:t>
+      </w:r>
+    </w:p>
+    <w:p>
+      <w:pPr>
+        <w:rPr>
+          <w:color w:val="000000" w:themeColor="text1"/>
+        </w:rPr>
+      </w:pPr>
+      <w:r>
+        <w:rPr>
+          <w:color w:val="000000" w:themeColor="text1"/>
+        </w:rPr>
+        <w:t xml:space="preserve">Güvenilir kaynaklardan veri topladım ve kaynaklarımı gösterdim.</w:t>
+      </w:r>
+    </w:p>
+    <w:p>
+      <w:pPr>
+        <w:rPr>
+          <w:color w:val="000000" w:themeColor="text1"/>
+        </w:rPr>
+      </w:pPr>
+      <w:r>
+        <w:rPr>
+          <w:rFonts w:ascii="Segoe UI Symbol" w:hAnsi="Segoe UI Symbol" w:cs="Segoe UI Symbol"/>
+          <w:color w:val="000000" w:themeColor="text1"/>
+        </w:rPr>
+        <w:t>☐</w:t>
+      </w:r>
+      <w:r>
+        <w:rPr>
+          <w:color w:val="000000" w:themeColor="text1"/>
+        </w:rPr>
+        <w:t xml:space="preserve"> 5  </w:t>
+      </w:r>
+      <w:r>
+        <w:rPr>
+          <w:rFonts w:ascii="Segoe UI Symbol" w:hAnsi="Segoe UI Symbol" w:cs="Segoe UI Symbol"/>
+          <w:color w:val="000000" w:themeColor="text1"/>
+        </w:rPr>
+        <w:t>☐</w:t>
+      </w:r>
+      <w:r>
+        <w:rPr>
+          <w:color w:val="000000" w:themeColor="text1"/>
+        </w:rPr>
+        <w:t xml:space="preserve"> 4  </w:t>
+      </w:r>
+      <w:r>
+        <w:rPr>
+          <w:rFonts w:ascii="Segoe UI Symbol" w:hAnsi="Segoe UI Symbol" w:cs="Segoe UI Symbol"/>
+          <w:color w:val="000000" w:themeColor="text1"/>
+        </w:rPr>
+        <w:t>☐</w:t>
+      </w:r>
+      <w:r>
+        <w:rPr>
+          <w:color w:val="000000" w:themeColor="text1"/>
+        </w:rPr>
+        <w:t xml:space="preserve"> 3  </w:t>
+      </w:r>
+      <w:r>
+        <w:rPr>
+          <w:rFonts w:ascii="Segoe UI Symbol" w:hAnsi="Segoe UI Symbol" w:cs="Segoe UI Symbol"/>
+          <w:color w:val="000000" w:themeColor="text1"/>
+        </w:rPr>
+        <w:t>☐</w:t>
+      </w:r>
+      <w:r>
+        <w:rPr>
+          <w:color w:val="000000" w:themeColor="text1"/>
+        </w:rPr>
+        <w:t xml:space="preserve"> 2  </w:t>
+      </w:r>
+      <w:r>
+        <w:rPr>
+          <w:rFonts w:ascii="Segoe UI Symbol" w:hAnsi="Segoe UI Symbol" w:cs="Segoe UI Symbol"/>
+          <w:color w:val="000000" w:themeColor="text1"/>
+        </w:rPr>
+        <w:t>☐</w:t>
+      </w:r>
+      <w:r>
+        <w:rPr>
+          <w:color w:val="000000" w:themeColor="text1"/>
+        </w:rPr>
+        <w:t xml:space="preserve"> 1</w:t>
+      </w:r>
+    </w:p>
+    <w:p>
+      <w:pPr>
+        <w:rPr>
+          <w:color w:val="000000" w:themeColor="text1"/>
+        </w:rPr>
+      </w:pPr>
+      <w:r>
+        <w:rPr>
+          <w:color w:val="000000" w:themeColor="text1"/>
+        </w:rPr>
+        <w:t xml:space="preserve">Topladığım verilerden çıkarımlar yapabildim.</w:t>
+      </w:r>
+    </w:p>
+    <w:p>
+      <w:pPr>
+        <w:rPr>
+          <w:color w:val="000000" w:themeColor="text1"/>
+        </w:rPr>
+      </w:pPr>
+      <w:r>
+        <w:rPr>
+          <w:rFonts w:ascii="Segoe UI Symbol" w:hAnsi="Segoe UI Symbol" w:cs="Segoe UI Symbol"/>
+          <w:color w:val="000000" w:themeColor="text1"/>
+        </w:rPr>
+        <w:t>☐</w:t>
+      </w:r>
+      <w:r>
+        <w:rPr>
+          <w:color w:val="000000" w:themeColor="text1"/>
+        </w:rPr>
+        <w:t xml:space="preserve"> 5  </w:t>
+      </w:r>
+      <w:r>
+        <w:rPr>
+          <w:rFonts w:ascii="Segoe UI Symbol" w:hAnsi="Segoe UI Symbol" w:cs="Segoe UI Symbol"/>
+          <w:color w:val="000000" w:themeColor="text1"/>
+        </w:rPr>
+        <w:t>☐</w:t>
+      </w:r>
+      <w:r>
+        <w:rPr>
+          <w:color w:val="000000" w:themeColor="text1"/>
+        </w:rPr>
+        <w:t xml:space="preserve"> 4  </w:t>
+      </w:r>
+      <w:r>
+        <w:rPr>
+          <w:rFonts w:ascii="Segoe UI Symbol" w:hAnsi="Segoe UI Symbol" w:cs="Segoe UI Symbol"/>
+          <w:color w:val="000000" w:themeColor="text1"/>
+        </w:rPr>
+        <w:t>☐</w:t>
+      </w:r>
+      <w:r>
+        <w:rPr>
+          <w:color w:val="000000" w:themeColor="text1"/>
+        </w:rPr>
+        <w:t xml:space="preserve"> 3  </w:t>
+      </w:r>
+      <w:r>
+        <w:rPr>
+          <w:rFonts w:ascii="Segoe UI Symbol" w:hAnsi="Segoe UI Symbol" w:cs="Segoe UI Symbol"/>
+          <w:color w:val="000000" w:themeColor="text1"/>
+        </w:rPr>
+        <w:t>☐</w:t>
+      </w:r>
+      <w:r>
+        <w:rPr>
+          <w:color w:val="000000" w:themeColor="text1"/>
+        </w:rPr>
+        <w:t xml:space="preserve"> 2  </w:t>
+      </w:r>
+      <w:r>
+        <w:rPr>
+          <w:rFonts w:ascii="Segoe UI Symbol" w:hAnsi="Segoe UI Symbol" w:cs="Segoe UI Symbol"/>
+          <w:color w:val="000000" w:themeColor="text1"/>
+        </w:rPr>
+        <w:t>☐</w:t>
+      </w:r>
+      <w:r>
+        <w:rPr>
+          <w:color w:val="000000" w:themeColor="text1"/>
+        </w:rPr>
+        <w:t xml:space="preserve"> 1</w:t>
+      </w:r>
+    </w:p>
+    <w:p>
+      <w:pPr>
+        <w:pStyle w:val="Heading2"/>
+        <w:rPr>
+          <w:rFonts w:ascii="Times New Roman" w:hAnsi="Times New Roman" w:cs="Times New Roman"/>
+          <w:color w:val="000000" w:themeColor="text1"/>
+          <w:sz w:val="24"/>
+          <w:szCs w:val="24"/>
+        </w:rPr>
+      </w:pPr>
+      <w:r>
+        <w:rPr>
+          <w:rFonts w:ascii="Times New Roman" w:hAnsi="Times New Roman" w:cs="Times New Roman"/>
+          <w:b/>
+          <w:bCs/>
+          <w:color w:val="000000" w:themeColor="text1"/>
+          <w:sz w:val="24"/>
+          <w:szCs w:val="24"/>
+        </w:rPr>
+        <w:t xml:space="preserve">3. Bilimsel Açıklama</w:t>
+      </w:r>
+    </w:p>
+    <w:p>
+      <w:pPr>
+        <w:rPr>
+          <w:color w:val="000000" w:themeColor="text1"/>
+        </w:rPr>
+      </w:pPr>
+      <w:r>
+        <w:rPr>
+          <w:color w:val="000000" w:themeColor="text1"/>
+        </w:rPr>
+        <w:t xml:space="preserve">Seçtiğim çevre sorununu çözünürlük dengesi ve Le Chatelier ilkesiyle açıklayabilirim.</w:t>
+      </w:r>
+    </w:p>
+    <w:p>
+      <w:pPr>
+        <w:rPr>
+          <w:color w:val="000000" w:themeColor="text1"/>
+        </w:rPr>
+      </w:pPr>
+      <w:r>
+        <w:rPr>
+          <w:rFonts w:ascii="Segoe UI Symbol" w:hAnsi="Segoe UI Symbol" w:cs="Segoe UI Symbol"/>
+          <w:color w:val="000000" w:themeColor="text1"/>
+        </w:rPr>
+        <w:t>☐</w:t>
+      </w:r>
+      <w:r>
+        <w:rPr>
+          <w:color w:val="000000" w:themeColor="text1"/>
+        </w:rPr>
+        <w:t xml:space="preserve"> 5  </w:t>
+      </w:r>
+      <w:r>
+        <w:rPr>
+          <w:rFonts w:ascii="Segoe UI Symbol" w:hAnsi="Segoe UI Symbol" w:cs="Segoe UI Symbol"/>
+          <w:color w:val="000000" w:themeColor="text1"/>
+        </w:rPr>
+        <w:t>☐</w:t>
+      </w:r>
+      <w:r>
+        <w:rPr>
+          <w:color w:val="000000" w:themeColor="text1"/>
+        </w:rPr>
+        <w:t xml:space="preserve"> 4  </w:t>
+      </w:r>
+      <w:r>
+        <w:rPr>
+          <w:rFonts w:ascii="Segoe UI Symbol" w:hAnsi="Segoe UI Symbol" w:cs="Segoe UI Symbol"/>
+          <w:color w:val="000000" w:themeColor="text1"/>
+        </w:rPr>
+        <w:t>☐</w:t>
+      </w:r>
+      <w:r>
+        <w:rPr>
+          <w:color w:val="000000" w:themeColor="text1"/>
+        </w:rPr>
+        <w:t xml:space="preserve"> 3  </w:t>
+      </w:r>
+      <w:r>
+        <w:rPr>
+          <w:rFonts w:ascii="Segoe UI Symbol" w:hAnsi="Segoe UI Symbol" w:cs="Segoe UI Symbol"/>
+          <w:color w:val="000000" w:themeColor="text1"/>
+        </w:rPr>
+        <w:t>☐</w:t>
+      </w:r>
+      <w:r>
+        <w:rPr>
+          <w:color w:val="000000" w:themeColor="text1"/>
+        </w:rPr>
+        <w:t xml:space="preserve"> 2  </w:t>
+      </w:r>
+      <w:r>
+        <w:rPr>
+          <w:rFonts w:ascii="Segoe UI Symbol" w:hAnsi="Segoe UI Symbol" w:cs="Segoe UI Symbol"/>
+          <w:color w:val="000000" w:themeColor="text1"/>
+        </w:rPr>
+        <w:t>☐</w:t>
+      </w:r>
+      <w:r>
+        <w:rPr>
+          <w:color w:val="000000" w:themeColor="text1"/>
+        </w:rPr>
+        <w:t xml:space="preserve"> 1</w:t>
+      </w:r>
+    </w:p>
+    <w:p>
+      <w:pPr>
+        <w:rPr>
+          <w:color w:val="000000" w:themeColor="text1"/>
+        </w:rPr>
+      </w:pPr>
+      <w:r>
+        <w:rPr>
+          <w:color w:val="000000" w:themeColor="text1"/>
+        </w:rPr>
+        <w:t xml:space="preserve">Verilere dayalı, uygulanabilir çözüm önerileri geliştirdim.</w:t>
       </w:r>
     </w:p>
     <w:p>

</xml_diff>